<commit_message>
fix: use case and requirements fix
</commit_message>
<xml_diff>
--- a/Analise e Projeto/documentos/Documento de Requisitos Lattes Corrigido.docx
+++ b/Analise e Projeto/documentos/Documento de Requisitos Lattes Corrigido.docx
@@ -13,7 +13,7 @@
           <wp:inline distB="114300" distT="114300" distL="114300" distR="114300">
             <wp:extent cx="4224338" cy="1712190"/>
             <wp:effectExtent b="0" l="0" r="0" t="0"/>
-            <wp:docPr id="2" name="image1.png"/>
+            <wp:docPr id="3" name="image1.png"/>
             <a:graphic>
               <a:graphicData uri="http://schemas.openxmlformats.org/drawingml/2006/picture">
                 <pic:pic>
@@ -1323,11 +1323,6 @@
         </w:rPr>
         <w:t xml:space="preserve">: O sistema deve permitir que administradores criem novas contas de usuários. Os administradores deverão preencher os seguintes dados ao criar uma conta: nome completo, email, CPF, instituição de vínculo, e senha temporária. Os dados dos usuários podem ser coletados através de formulários preenchidos pelos próprios usuários ou importados de sistemas externos integrados.</w:t>
       </w:r>
-      <w:r>
-        <w:rPr>
-          <w:rtl w:val="0"/>
-        </w:rPr>
-      </w:r>
     </w:p>
     <w:p>
       <w:pPr>
@@ -1362,11 +1357,6 @@
         </w:rPr>
         <w:t xml:space="preserve">: O sistema deve permitir que usuários façam login com suas credenciais. As credenciais de acesso serão enviadas automaticamente por e-mail aos usuários após o cadastro ser concluído pelo administrador, contendo um link para definir uma senha definitiva.</w:t>
       </w:r>
-      <w:r>
-        <w:rPr>
-          <w:rtl w:val="0"/>
-        </w:rPr>
-      </w:r>
     </w:p>
     <w:p>
       <w:pPr>
@@ -1401,11 +1391,6 @@
         </w:rPr>
         <w:t xml:space="preserve">: O sistema suportará arquivos em XML, PDF e outros formatos especificados para importação de currículos.</w:t>
       </w:r>
-      <w:r>
-        <w:rPr>
-          <w:rtl w:val="0"/>
-        </w:rPr>
-      </w:r>
     </w:p>
     <w:p>
       <w:pPr>
@@ -1523,11 +1508,6 @@
         </w:rPr>
         <w:t xml:space="preserve">O sistema deve garantir que cada pesquisa receba um identificador único, e este será utilizado para evitar duplicações no banco de dados.</w:t>
       </w:r>
-      <w:r>
-        <w:rPr>
-          <w:rtl w:val="0"/>
-        </w:rPr>
-      </w:r>
     </w:p>
     <w:p>
       <w:pPr>
@@ -1562,11 +1542,6 @@
         </w:rPr>
         <w:t xml:space="preserve">: Os administradores podem editar todas as seções do currículo, exceto dados pessoais sensíveis como CPF e e-mail, que só poderão ser alterados pelos próprios usuários.</w:t>
       </w:r>
-      <w:r>
-        <w:rPr>
-          <w:rtl w:val="0"/>
-        </w:rPr>
-      </w:r>
     </w:p>
     <w:p>
       <w:pPr>
@@ -1608,7 +1583,7 @@
           <w:ilvl w:val="0"/>
           <w:numId w:val="1"/>
         </w:numPr>
-        <w:spacing w:after="240" w:before="0" w:lineRule="auto"/>
+        <w:spacing w:after="0" w:before="0" w:line="276" w:lineRule="auto"/>
         <w:ind w:left="720" w:hanging="360"/>
         <w:rPr>
           <w:b w:val="1"/>
@@ -1644,10 +1619,75 @@
         </w:rPr>
         <w:t xml:space="preserve">O sistema deve garantir que apenas usuários com permissão de administrador possam realizar ações administrativas, como a criação e edição de contas.</w:t>
       </w:r>
-      <w:r>
-        <w:rPr>
-          <w:rtl w:val="0"/>
-        </w:rPr>
+    </w:p>
+    <w:p>
+      <w:pPr>
+        <w:numPr>
+          <w:ilvl w:val="0"/>
+          <w:numId w:val="1"/>
+        </w:numPr>
+        <w:spacing w:after="0" w:before="0" w:line="276" w:lineRule="auto"/>
+        <w:ind w:left="720" w:hanging="360"/>
+        <w:rPr>
+          <w:i w:val="1"/>
+          <w:sz w:val="24"/>
+          <w:szCs w:val="24"/>
+          <w:u w:val="none"/>
+        </w:rPr>
+      </w:pPr>
+      <w:r>
+        <w:rPr>
+          <w:b w:val="1"/>
+          <w:i w:val="1"/>
+          <w:sz w:val="24"/>
+          <w:szCs w:val="24"/>
+          <w:rtl w:val="0"/>
+        </w:rPr>
+        <w:t xml:space="preserve">RF10</w:t>
+      </w:r>
+      <w:r>
+        <w:rPr>
+          <w:i w:val="1"/>
+          <w:sz w:val="24"/>
+          <w:szCs w:val="24"/>
+          <w:rtl w:val="0"/>
+        </w:rPr>
+        <w:t xml:space="preserve">: O sistema deve realizar uma verificação completa de todas as configurações críticas, integridade do banco de dados e serviços dependentes ao ser inicializado, garantindo um funcionamento correto.</w:t>
+      </w:r>
+    </w:p>
+    <w:p>
+      <w:pPr>
+        <w:numPr>
+          <w:ilvl w:val="0"/>
+          <w:numId w:val="1"/>
+        </w:numPr>
+        <w:spacing w:after="0" w:before="0" w:line="276" w:lineRule="auto"/>
+        <w:ind w:left="720" w:hanging="360"/>
+        <w:rPr>
+          <w:i w:val="1"/>
+          <w:sz w:val="24"/>
+          <w:szCs w:val="24"/>
+          <w:u w:val="none"/>
+        </w:rPr>
+      </w:pPr>
+      <w:r>
+        <w:rPr>
+          <w:b w:val="1"/>
+          <w:i w:val="1"/>
+          <w:sz w:val="24"/>
+          <w:szCs w:val="24"/>
+          <w:rtl w:val="0"/>
+        </w:rPr>
+        <w:t xml:space="preserve">RF11</w:t>
+      </w:r>
+      <w:r>
+        <w:rPr>
+          <w:i w:val="1"/>
+          <w:sz w:val="24"/>
+          <w:szCs w:val="24"/>
+          <w:rtl w:val="0"/>
+        </w:rPr>
+        <w:t xml:space="preserve">: O sistema deve permitir que os usuários visualizem seus currículos completos, incluindo todas as informações e seções armazenadas, em um formato de fácil leitura e navegável.</w:t>
       </w:r>
     </w:p>
     <w:p>
@@ -1750,11 +1790,6 @@
           <w:rtl w:val="0"/>
         </w:rPr>
         <w:t xml:space="preserve">: O tempo de resposta do sistema deve ser inferior a 2 segundos para operações comuns que incluem o login de usuários, edição de currículos e geração de relatórios de atividades.</w:t>
-      </w:r>
-      <w:r>
-        <w:rPr>
-          <w:rtl w:val="0"/>
-        </w:rPr>
       </w:r>
     </w:p>
     <w:p>
@@ -3108,6 +3143,142 @@
     <w:rPr>
       <w:sz w:val="52"/>
       <w:szCs w:val="52"/>
+    </w:rPr>
+  </w:style>
+  <w:style w:type="paragraph" w:styleId="Normal" w:default="1">
+    <w:name w:val="normal"/>
+  </w:style>
+  <w:style w:type="table" w:styleId="TableNormal" w:default="1">
+    <w:name w:val="Table Normal"/>
+  </w:style>
+  <w:style w:type="paragraph" w:styleId="Heading1">
+    <w:name w:val="heading 1"/>
+    <w:basedOn w:val="Normal"/>
+    <w:next w:val="Normal"/>
+    <w:pPr>
+      <w:keepNext w:val="1"/>
+      <w:keepLines w:val="1"/>
+      <w:pageBreakBefore w:val="0"/>
+      <w:spacing w:after="120" w:before="400" w:lineRule="auto"/>
+    </w:pPr>
+    <w:rPr>
+      <w:sz w:val="40"/>
+      <w:szCs w:val="40"/>
+    </w:rPr>
+  </w:style>
+  <w:style w:type="paragraph" w:styleId="Heading2">
+    <w:name w:val="heading 2"/>
+    <w:basedOn w:val="Normal"/>
+    <w:next w:val="Normal"/>
+    <w:pPr>
+      <w:keepNext w:val="1"/>
+      <w:keepLines w:val="1"/>
+      <w:pageBreakBefore w:val="0"/>
+      <w:spacing w:after="120" w:before="360" w:lineRule="auto"/>
+    </w:pPr>
+    <w:rPr>
+      <w:b w:val="0"/>
+      <w:sz w:val="32"/>
+      <w:szCs w:val="32"/>
+    </w:rPr>
+  </w:style>
+  <w:style w:type="paragraph" w:styleId="Heading3">
+    <w:name w:val="heading 3"/>
+    <w:basedOn w:val="Normal"/>
+    <w:next w:val="Normal"/>
+    <w:pPr>
+      <w:keepNext w:val="1"/>
+      <w:keepLines w:val="1"/>
+      <w:pageBreakBefore w:val="0"/>
+      <w:spacing w:after="80" w:before="320" w:lineRule="auto"/>
+    </w:pPr>
+    <w:rPr>
+      <w:b w:val="0"/>
+      <w:color w:val="434343"/>
+      <w:sz w:val="28"/>
+      <w:szCs w:val="28"/>
+    </w:rPr>
+  </w:style>
+  <w:style w:type="paragraph" w:styleId="Heading4">
+    <w:name w:val="heading 4"/>
+    <w:basedOn w:val="Normal"/>
+    <w:next w:val="Normal"/>
+    <w:pPr>
+      <w:keepNext w:val="1"/>
+      <w:keepLines w:val="1"/>
+      <w:pageBreakBefore w:val="0"/>
+      <w:spacing w:after="80" w:before="280" w:lineRule="auto"/>
+    </w:pPr>
+    <w:rPr>
+      <w:color w:val="666666"/>
+      <w:sz w:val="24"/>
+      <w:szCs w:val="24"/>
+    </w:rPr>
+  </w:style>
+  <w:style w:type="paragraph" w:styleId="Heading5">
+    <w:name w:val="heading 5"/>
+    <w:basedOn w:val="Normal"/>
+    <w:next w:val="Normal"/>
+    <w:pPr>
+      <w:keepNext w:val="1"/>
+      <w:keepLines w:val="1"/>
+      <w:pageBreakBefore w:val="0"/>
+      <w:spacing w:after="80" w:before="240" w:lineRule="auto"/>
+    </w:pPr>
+    <w:rPr>
+      <w:color w:val="666666"/>
+      <w:sz w:val="22"/>
+      <w:szCs w:val="22"/>
+    </w:rPr>
+  </w:style>
+  <w:style w:type="paragraph" w:styleId="Heading6">
+    <w:name w:val="heading 6"/>
+    <w:basedOn w:val="Normal"/>
+    <w:next w:val="Normal"/>
+    <w:pPr>
+      <w:keepNext w:val="1"/>
+      <w:keepLines w:val="1"/>
+      <w:pageBreakBefore w:val="0"/>
+      <w:spacing w:after="80" w:before="240" w:lineRule="auto"/>
+    </w:pPr>
+    <w:rPr>
+      <w:i w:val="1"/>
+      <w:color w:val="666666"/>
+      <w:sz w:val="22"/>
+      <w:szCs w:val="22"/>
+    </w:rPr>
+  </w:style>
+  <w:style w:type="paragraph" w:styleId="Title">
+    <w:name w:val="Title"/>
+    <w:basedOn w:val="Normal"/>
+    <w:next w:val="Normal"/>
+    <w:pPr>
+      <w:keepNext w:val="1"/>
+      <w:keepLines w:val="1"/>
+      <w:pageBreakBefore w:val="0"/>
+      <w:spacing w:after="60" w:before="0" w:lineRule="auto"/>
+    </w:pPr>
+    <w:rPr>
+      <w:sz w:val="52"/>
+      <w:szCs w:val="52"/>
+    </w:rPr>
+  </w:style>
+  <w:style w:type="paragraph" w:styleId="Subtitle">
+    <w:name w:val="Subtitle"/>
+    <w:basedOn w:val="Normal"/>
+    <w:next w:val="Normal"/>
+    <w:pPr>
+      <w:keepNext w:val="1"/>
+      <w:keepLines w:val="1"/>
+      <w:pageBreakBefore w:val="0"/>
+      <w:spacing w:after="320" w:before="0" w:lineRule="auto"/>
+    </w:pPr>
+    <w:rPr>
+      <w:rFonts w:ascii="Arial" w:cs="Arial" w:eastAsia="Arial" w:hAnsi="Arial"/>
+      <w:i w:val="0"/>
+      <w:color w:val="666666"/>
+      <w:sz w:val="30"/>
+      <w:szCs w:val="30"/>
     </w:rPr>
   </w:style>
   <w:style w:type="paragraph" w:styleId="Subtitle">
@@ -3471,7 +3642,7 @@
 
 <file path=customXML/item1.xml><?xml version="1.0" encoding="utf-8"?>
 <go:gDocsCustomXmlDataStorage xmlns:go="http://customooxmlschemas.google.com/" xmlns:r="http://schemas.openxmlformats.org/officeDocument/2006/relationships" uri="GoogleDocsCustomDataVersion2">
-  <go:docsCustomData xmlns:go="http://customooxmlschemas.google.com/" roundtripDataSignature="AMtx7mhPxybnvxMcnkf6KSP0ZSjtEQdh0g==">CgMxLjAyCGguZ2pkZ3hzMgloLjMwajB6bGwyCWguMWZvYjl0ZTgAciExbXFGaUhpWTRleTRTdW1YYk5XWE96NHFwazEyclV4QWo=</go:docsCustomData>
+  <go:docsCustomData xmlns:go="http://customooxmlschemas.google.com/" roundtripDataSignature="AMtx7mgEJGWJX2TDhKJTpNdY43XqHDZs7g==">CgMxLjAyCGguZ2pkZ3hzMgloLjMwajB6bGwyCWguMWZvYjl0ZTgAciExbU1xY3dodGFyRldmbHE4X2hUbTktVXJoWFp1M0RyMUE=</go:docsCustomData>
 </go:gDocsCustomXmlDataStorage>
 </file>
 

</xml_diff>